<commit_message>
some minor changes done
</commit_message>
<xml_diff>
--- a/public/Resume.docx
+++ b/public/Resume.docx
@@ -625,6 +625,7 @@
           <w:rFonts w:ascii="Google Sans" w:eastAsia="Google Sans" w:hAnsi="Google Sans" w:cs="Google Sans"/>
           <w:color w:val="1F1F1F"/>
         </w:rPr>
+        <w:lastRenderedPageBreak/>
         <w:t>Key Projects</w:t>
       </w:r>
     </w:p>
@@ -1275,6 +1276,45 @@
     </w:p>
     <w:p>
       <w:pPr>
+        <w:pBdr>
+          <w:top w:val="nil"/>
+          <w:left w:val="nil"/>
+          <w:bottom w:val="nil"/>
+          <w:right w:val="nil"/>
+          <w:between w:val="nil"/>
+        </w:pBdr>
+        <w:spacing w:line="275" w:lineRule="auto"/>
+        <w:ind w:left="590"/>
+      </w:pPr>
+    </w:p>
+    <w:p>
+      <w:pPr>
+        <w:pBdr>
+          <w:top w:val="nil"/>
+          <w:left w:val="nil"/>
+          <w:bottom w:val="nil"/>
+          <w:right w:val="nil"/>
+          <w:between w:val="nil"/>
+        </w:pBdr>
+        <w:spacing w:line="275" w:lineRule="auto"/>
+        <w:ind w:left="590"/>
+      </w:pPr>
+    </w:p>
+    <w:p>
+      <w:pPr>
+        <w:pBdr>
+          <w:top w:val="nil"/>
+          <w:left w:val="nil"/>
+          <w:bottom w:val="nil"/>
+          <w:right w:val="nil"/>
+          <w:between w:val="nil"/>
+        </w:pBdr>
+        <w:spacing w:line="275" w:lineRule="auto"/>
+        <w:ind w:left="590"/>
+      </w:pPr>
+    </w:p>
+    <w:p>
+      <w:pPr>
         <w:pStyle w:val="Heading3"/>
         <w:spacing w:before="0" w:line="275" w:lineRule="auto"/>
         <w:rPr>
@@ -1287,6 +1327,7 @@
           <w:rFonts w:ascii="Google Sans" w:eastAsia="Google Sans" w:hAnsi="Google Sans" w:cs="Google Sans"/>
           <w:color w:val="1F1F1F"/>
         </w:rPr>
+        <w:lastRenderedPageBreak/>
         <w:t>Education</w:t>
       </w:r>
     </w:p>
@@ -1312,16 +1353,7 @@
           <w:bCs/>
           <w:color w:val="1F1F1F"/>
         </w:rPr>
-        <w:t>B. Tech</w:t>
-      </w:r>
-      <w:r>
-        <w:rPr>
-          <w:rFonts w:ascii="Google Sans" w:eastAsia="Google Sans" w:hAnsi="Google Sans" w:cs="Google Sans"/>
-          <w:b/>
-          <w:bCs/>
-          <w:color w:val="1F1F1F"/>
-        </w:rPr>
-        <w:t xml:space="preserve"> in Computer Science &amp; Engineering</w:t>
+        <w:t>B. Tech in Computer Science &amp; Engineering</w:t>
       </w:r>
     </w:p>
     <w:p>
@@ -1933,10 +1965,11 @@
       </w:hyperlink>
     </w:p>
     <w:sectPr>
-      <w:pgSz w:w="12240" w:h="15840"/>
+      <w:pgSz w:w="11906" w:h="16838" w:code="9"/>
       <w:pgMar w:top="720" w:right="720" w:bottom="720" w:left="720" w:header="0" w:footer="720" w:gutter="0"/>
       <w:pgNumType w:start="1"/>
       <w:cols w:space="720"/>
+      <w:docGrid w:linePitch="299"/>
     </w:sectPr>
   </w:body>
 </w:document>

</xml_diff>

<commit_message>
some readme changes done
</commit_message>
<xml_diff>
--- a/public/Resume.docx
+++ b/public/Resume.docx
@@ -1,6 +1,6 @@
 
 <file path=word/document.xml><?xml version="1.0" encoding="utf-8"?>
-<w:document xmlns:wpc="http://schemas.microsoft.com/office/word/2010/wordprocessingCanvas" xmlns:cx="http://schemas.microsoft.com/office/drawing/2014/chartex" xmlns:cx1="http://schemas.microsoft.com/office/drawing/2015/9/8/chartex" xmlns:cx2="http://schemas.microsoft.com/office/drawing/2015/10/21/chartex" xmlns:cx3="http://schemas.microsoft.com/office/drawing/2016/5/9/chartex" xmlns:cx4="http://schemas.microsoft.com/office/drawing/2016/5/10/chartex" xmlns:cx5="http://schemas.microsoft.com/office/drawing/2016/5/11/chartex" xmlns:cx6="http://schemas.microsoft.com/office/drawing/2016/5/12/chartex" xmlns:cx7="http://schemas.microsoft.com/office/drawing/2016/5/13/chartex" xmlns:cx8="http://schemas.microsoft.com/office/drawing/2016/5/14/chartex" xmlns:mc="http://schemas.openxmlformats.org/markup-compatibility/2006" xmlns:aink="http://schemas.microsoft.com/office/drawing/2016/ink" xmlns:am3d="http://schemas.microsoft.com/office/drawing/2017/model3d" xmlns:o="urn:schemas-microsoft-com:office:office" xmlns:oel="http://schemas.microsoft.com/office/2019/extlst" xmlns:r="http://schemas.openxmlformats.org/officeDocument/2006/relationships" xmlns:m="http://schemas.openxmlformats.org/officeDocument/2006/math" xmlns:v="urn:schemas-microsoft-com:vml" xmlns:wp14="http://schemas.microsoft.com/office/word/2010/wordprocessingDrawing" xmlns:wp="http://schemas.openxmlformats.org/drawingml/2006/wordprocessingDrawing" xmlns:w10="urn:schemas-microsoft-com:office:word" xmlns:w="http://schemas.openxmlformats.org/wordprocessingml/2006/main" xmlns:w14="http://schemas.microsoft.com/office/word/2010/wordml" xmlns:w15="http://schemas.microsoft.com/office/word/2012/wordml" xmlns:w16cei="http://schemas.microsoft.com/office/word/2026/wordml/cei" xmlns:w16cex="http://schemas.microsoft.com/office/word/2018/wordml/cex" xmlns:w16cid="http://schemas.microsoft.com/office/word/2016/wordml/cid" xmlns:w16="http://schemas.microsoft.com/office/word/2018/wordml" xmlns:w16du="http://schemas.microsoft.com/office/word/2023/wordml/word16du" xmlns:w16sdtdh="http://schemas.microsoft.com/office/word/2020/wordml/sdtdatahash" xmlns:w16sdtfl="http://schemas.microsoft.com/office/word/2024/wordml/sdtformatlock" xmlns:w16se="http://schemas.microsoft.com/office/word/2015/wordml/symex" xmlns:wpg="http://schemas.microsoft.com/office/word/2010/wordprocessingGroup" xmlns:wpi="http://schemas.microsoft.com/office/word/2010/wordprocessingInk" xmlns:wne="http://schemas.microsoft.com/office/word/2006/wordml" xmlns:wps="http://schemas.microsoft.com/office/word/2010/wordprocessingShape" mc:Ignorable="w14 w15 w16se w16cid w16 w16cex w16sdtdh w16sdtfl w16du wp14">
+<w:document xmlns:wpc="http://schemas.microsoft.com/office/word/2010/wordprocessingCanvas" xmlns:cx="http://schemas.microsoft.com/office/drawing/2014/chartex" xmlns:cx1="http://schemas.microsoft.com/office/drawing/2015/9/8/chartex" xmlns:cx2="http://schemas.microsoft.com/office/drawing/2015/10/21/chartex" xmlns:cx3="http://schemas.microsoft.com/office/drawing/2016/5/9/chartex" xmlns:cx4="http://schemas.microsoft.com/office/drawing/2016/5/10/chartex" xmlns:cx5="http://schemas.microsoft.com/office/drawing/2016/5/11/chartex" xmlns:cx6="http://schemas.microsoft.com/office/drawing/2016/5/12/chartex" xmlns:cx7="http://schemas.microsoft.com/office/drawing/2016/5/13/chartex" xmlns:cx8="http://schemas.microsoft.com/office/drawing/2016/5/14/chartex" xmlns:mc="http://schemas.openxmlformats.org/markup-compatibility/2006" xmlns:aink="http://schemas.microsoft.com/office/drawing/2016/ink" xmlns:am3d="http://schemas.microsoft.com/office/drawing/2017/model3d" xmlns:o="urn:schemas-microsoft-com:office:office" xmlns:oel="http://schemas.microsoft.com/office/2019/extlst" xmlns:r="http://schemas.openxmlformats.org/officeDocument/2006/relationships" xmlns:m="http://schemas.openxmlformats.org/officeDocument/2006/math" xmlns:v="urn:schemas-microsoft-com:vml" xmlns:wp14="http://schemas.microsoft.com/office/word/2010/wordprocessingDrawing" xmlns:wp="http://schemas.openxmlformats.org/drawingml/2006/wordprocessingDrawing" xmlns:w10="urn:schemas-microsoft-com:office:word" xmlns:w="http://schemas.openxmlformats.org/wordprocessingml/2006/main" xmlns:w14="http://schemas.microsoft.com/office/word/2010/wordml" xmlns:w15="http://schemas.microsoft.com/office/word/2012/wordml" xmlns:w16cex="http://schemas.microsoft.com/office/word/2018/wordml/cex" xmlns:w16cid="http://schemas.microsoft.com/office/word/2016/wordml/cid" xmlns:w16="http://schemas.microsoft.com/office/word/2018/wordml" xmlns:w16du="http://schemas.microsoft.com/office/word/2023/wordml/word16du" xmlns:w16sdtdh="http://schemas.microsoft.com/office/word/2020/wordml/sdtdatahash" xmlns:w16sdtfl="http://schemas.microsoft.com/office/word/2024/wordml/sdtformatlock" xmlns:w16se="http://schemas.microsoft.com/office/word/2015/wordml/symex" xmlns:wpg="http://schemas.microsoft.com/office/word/2010/wordprocessingGroup" xmlns:wpi="http://schemas.microsoft.com/office/word/2010/wordprocessingInk" xmlns:wne="http://schemas.microsoft.com/office/word/2006/wordml" xmlns:wps="http://schemas.microsoft.com/office/word/2010/wordprocessingShape" mc:Ignorable="w14 w15 w16se w16cid w16 w16cex w16sdtdh w16sdtfl w16du wp14">
   <w:body>
     <w:p>
       <w:pPr>
@@ -459,12 +459,14 @@
     </w:p>
     <w:p>
       <w:pPr>
-        <w:pStyle w:val="Heading3"/>
-        <w:spacing w:before="0" w:line="275" w:lineRule="auto"/>
-        <w:rPr>
-          <w:rFonts w:ascii="Google Sans" w:eastAsia="Google Sans" w:hAnsi="Google Sans" w:cs="Google Sans"/>
-          <w:color w:val="1F1F1F"/>
-        </w:rPr>
+        <w:pBdr>
+          <w:top w:val="nil"/>
+          <w:left w:val="nil"/>
+          <w:bottom w:val="nil"/>
+          <w:right w:val="nil"/>
+          <w:between w:val="nil"/>
+        </w:pBdr>
+        <w:spacing w:line="275" w:lineRule="auto"/>
       </w:pPr>
     </w:p>
     <w:p>
@@ -611,6 +613,7 @@
     <w:p/>
     <w:p/>
     <w:p/>
+    <w:p/>
     <w:p>
       <w:pPr>
         <w:pStyle w:val="Heading3"/>
@@ -783,12 +786,15 @@
     </w:p>
     <w:p>
       <w:pPr>
-        <w:pStyle w:val="Heading4"/>
-        <w:spacing w:before="0" w:line="275" w:lineRule="auto"/>
-        <w:rPr>
-          <w:rFonts w:ascii="Google Sans" w:eastAsia="Google Sans" w:hAnsi="Google Sans" w:cs="Google Sans"/>
-          <w:color w:val="1F1F1F"/>
-        </w:rPr>
+        <w:pBdr>
+          <w:top w:val="nil"/>
+          <w:left w:val="nil"/>
+          <w:bottom w:val="nil"/>
+          <w:right w:val="nil"/>
+          <w:between w:val="nil"/>
+        </w:pBdr>
+        <w:spacing w:line="275" w:lineRule="auto"/>
+        <w:ind w:left="590"/>
       </w:pPr>
     </w:p>
     <w:p>
@@ -922,12 +928,14 @@
     </w:p>
     <w:p>
       <w:pPr>
-        <w:pStyle w:val="Heading4"/>
-        <w:spacing w:before="0" w:line="275" w:lineRule="auto"/>
-        <w:rPr>
-          <w:rFonts w:ascii="Google Sans" w:eastAsia="Google Sans" w:hAnsi="Google Sans" w:cs="Google Sans"/>
-          <w:color w:val="1F1F1F"/>
-        </w:rPr>
+        <w:pBdr>
+          <w:top w:val="nil"/>
+          <w:left w:val="nil"/>
+          <w:bottom w:val="nil"/>
+          <w:right w:val="nil"/>
+          <w:between w:val="nil"/>
+        </w:pBdr>
+        <w:spacing w:line="275" w:lineRule="auto"/>
       </w:pPr>
     </w:p>
     <w:p>
@@ -1038,12 +1046,14 @@
     </w:p>
     <w:p>
       <w:pPr>
-        <w:pStyle w:val="Heading4"/>
-        <w:spacing w:before="0" w:line="275" w:lineRule="auto"/>
-        <w:rPr>
-          <w:rFonts w:ascii="Google Sans" w:eastAsia="Google Sans" w:hAnsi="Google Sans" w:cs="Google Sans"/>
-          <w:color w:val="1F1F1F"/>
-        </w:rPr>
+        <w:pBdr>
+          <w:top w:val="nil"/>
+          <w:left w:val="nil"/>
+          <w:bottom w:val="nil"/>
+          <w:right w:val="nil"/>
+          <w:between w:val="nil"/>
+        </w:pBdr>
+        <w:spacing w:line="275" w:lineRule="auto"/>
       </w:pPr>
     </w:p>
     <w:p>
@@ -1156,161 +1166,206 @@
           <w:between w:val="nil"/>
         </w:pBdr>
         <w:spacing w:line="275" w:lineRule="auto"/>
-        <w:ind w:left="590"/>
-        <w:rPr>
-          <w:rFonts w:ascii="Google Sans" w:eastAsia="Google Sans" w:hAnsi="Google Sans" w:cs="Google Sans"/>
-          <w:color w:val="1F1F1F"/>
-        </w:rPr>
-      </w:pPr>
-    </w:p>
-    <w:p>
-      <w:pPr>
-        <w:pBdr>
-          <w:top w:val="nil"/>
-          <w:left w:val="nil"/>
-          <w:bottom w:val="nil"/>
-          <w:right w:val="nil"/>
-          <w:between w:val="nil"/>
-        </w:pBdr>
-        <w:spacing w:line="275" w:lineRule="auto"/>
-        <w:ind w:left="590"/>
-        <w:rPr>
-          <w:rFonts w:ascii="Google Sans" w:eastAsia="Google Sans" w:hAnsi="Google Sans" w:cs="Google Sans"/>
-          <w:color w:val="1F1F1F"/>
-        </w:rPr>
-      </w:pPr>
-    </w:p>
-    <w:p>
-      <w:pPr>
-        <w:pBdr>
-          <w:top w:val="nil"/>
-          <w:left w:val="nil"/>
-          <w:bottom w:val="nil"/>
-          <w:right w:val="nil"/>
-          <w:between w:val="nil"/>
-        </w:pBdr>
-        <w:spacing w:line="275" w:lineRule="auto"/>
-        <w:ind w:left="590"/>
-        <w:rPr>
-          <w:rFonts w:ascii="Google Sans" w:eastAsia="Google Sans" w:hAnsi="Google Sans" w:cs="Google Sans"/>
-          <w:color w:val="1F1F1F"/>
-        </w:rPr>
-      </w:pPr>
-    </w:p>
-    <w:p>
-      <w:pPr>
-        <w:pBdr>
-          <w:top w:val="nil"/>
-          <w:left w:val="nil"/>
-          <w:bottom w:val="nil"/>
-          <w:right w:val="nil"/>
-          <w:between w:val="nil"/>
-        </w:pBdr>
-        <w:spacing w:line="275" w:lineRule="auto"/>
-        <w:ind w:left="590"/>
-        <w:rPr>
-          <w:rFonts w:ascii="Google Sans" w:eastAsia="Google Sans" w:hAnsi="Google Sans" w:cs="Google Sans"/>
-          <w:color w:val="1F1F1F"/>
-        </w:rPr>
-      </w:pPr>
-    </w:p>
-    <w:p>
-      <w:pPr>
-        <w:pBdr>
-          <w:top w:val="nil"/>
-          <w:left w:val="nil"/>
-          <w:bottom w:val="nil"/>
-          <w:right w:val="nil"/>
-          <w:between w:val="nil"/>
-        </w:pBdr>
-        <w:spacing w:line="275" w:lineRule="auto"/>
-        <w:ind w:left="590"/>
-        <w:rPr>
-          <w:rFonts w:ascii="Google Sans" w:eastAsia="Google Sans" w:hAnsi="Google Sans" w:cs="Google Sans"/>
-          <w:color w:val="1F1F1F"/>
-        </w:rPr>
-      </w:pPr>
-    </w:p>
-    <w:p>
-      <w:pPr>
-        <w:pBdr>
-          <w:top w:val="nil"/>
-          <w:left w:val="nil"/>
-          <w:bottom w:val="nil"/>
-          <w:right w:val="nil"/>
-          <w:between w:val="nil"/>
-        </w:pBdr>
-        <w:spacing w:line="275" w:lineRule="auto"/>
-        <w:ind w:left="590"/>
-        <w:rPr>
-          <w:rFonts w:ascii="Google Sans" w:eastAsia="Google Sans" w:hAnsi="Google Sans" w:cs="Google Sans"/>
-          <w:color w:val="1F1F1F"/>
-        </w:rPr>
-      </w:pPr>
-    </w:p>
-    <w:p>
-      <w:pPr>
-        <w:pBdr>
-          <w:top w:val="nil"/>
-          <w:left w:val="nil"/>
-          <w:bottom w:val="nil"/>
-          <w:right w:val="nil"/>
-          <w:between w:val="nil"/>
-        </w:pBdr>
-        <w:spacing w:line="275" w:lineRule="auto"/>
-        <w:ind w:left="590"/>
-      </w:pPr>
-    </w:p>
-    <w:p>
-      <w:pPr>
-        <w:pBdr>
-          <w:top w:val="nil"/>
-          <w:left w:val="nil"/>
-          <w:bottom w:val="nil"/>
-          <w:right w:val="nil"/>
-          <w:between w:val="nil"/>
-        </w:pBdr>
-        <w:spacing w:line="275" w:lineRule="auto"/>
-        <w:ind w:left="590"/>
-      </w:pPr>
-    </w:p>
-    <w:p>
-      <w:pPr>
-        <w:pBdr>
-          <w:top w:val="nil"/>
-          <w:left w:val="nil"/>
-          <w:bottom w:val="nil"/>
-          <w:right w:val="nil"/>
-          <w:between w:val="nil"/>
-        </w:pBdr>
-        <w:spacing w:line="275" w:lineRule="auto"/>
-        <w:ind w:left="590"/>
-      </w:pPr>
-    </w:p>
-    <w:p>
-      <w:pPr>
-        <w:pBdr>
-          <w:top w:val="nil"/>
-          <w:left w:val="nil"/>
-          <w:bottom w:val="nil"/>
-          <w:right w:val="nil"/>
-          <w:between w:val="nil"/>
-        </w:pBdr>
-        <w:spacing w:line="275" w:lineRule="auto"/>
-        <w:ind w:left="590"/>
-      </w:pPr>
-    </w:p>
-    <w:p>
-      <w:pPr>
-        <w:pBdr>
-          <w:top w:val="nil"/>
-          <w:left w:val="nil"/>
-          <w:bottom w:val="nil"/>
-          <w:right w:val="nil"/>
-          <w:between w:val="nil"/>
-        </w:pBdr>
-        <w:spacing w:line="275" w:lineRule="auto"/>
-        <w:ind w:left="590"/>
+        <w:rPr>
+          <w:rFonts w:ascii="Google Sans" w:eastAsia="Google Sans" w:hAnsi="Google Sans" w:cs="Google Sans"/>
+          <w:color w:val="1F1F1F"/>
+        </w:rPr>
+      </w:pPr>
+    </w:p>
+    <w:p>
+      <w:pPr>
+        <w:pBdr>
+          <w:top w:val="nil"/>
+          <w:left w:val="nil"/>
+          <w:bottom w:val="nil"/>
+          <w:right w:val="nil"/>
+          <w:between w:val="nil"/>
+        </w:pBdr>
+        <w:spacing w:line="275" w:lineRule="auto"/>
+        <w:rPr>
+          <w:rFonts w:ascii="Google Sans" w:eastAsia="Google Sans" w:hAnsi="Google Sans" w:cs="Google Sans"/>
+          <w:color w:val="1F1F1F"/>
+        </w:rPr>
+      </w:pPr>
+    </w:p>
+    <w:p>
+      <w:pPr>
+        <w:pBdr>
+          <w:top w:val="nil"/>
+          <w:left w:val="nil"/>
+          <w:bottom w:val="nil"/>
+          <w:right w:val="nil"/>
+          <w:between w:val="nil"/>
+        </w:pBdr>
+        <w:spacing w:line="275" w:lineRule="auto"/>
+        <w:rPr>
+          <w:rFonts w:ascii="Google Sans" w:eastAsia="Google Sans" w:hAnsi="Google Sans" w:cs="Google Sans"/>
+          <w:color w:val="1F1F1F"/>
+        </w:rPr>
+      </w:pPr>
+    </w:p>
+    <w:p>
+      <w:pPr>
+        <w:pBdr>
+          <w:top w:val="nil"/>
+          <w:left w:val="nil"/>
+          <w:bottom w:val="nil"/>
+          <w:right w:val="nil"/>
+          <w:between w:val="nil"/>
+        </w:pBdr>
+        <w:spacing w:line="275" w:lineRule="auto"/>
+        <w:rPr>
+          <w:rFonts w:ascii="Google Sans" w:eastAsia="Google Sans" w:hAnsi="Google Sans" w:cs="Google Sans"/>
+          <w:color w:val="1F1F1F"/>
+        </w:rPr>
+      </w:pPr>
+    </w:p>
+    <w:p>
+      <w:pPr>
+        <w:pBdr>
+          <w:top w:val="nil"/>
+          <w:left w:val="nil"/>
+          <w:bottom w:val="nil"/>
+          <w:right w:val="nil"/>
+          <w:between w:val="nil"/>
+        </w:pBdr>
+        <w:spacing w:line="275" w:lineRule="auto"/>
+        <w:rPr>
+          <w:rFonts w:ascii="Google Sans" w:eastAsia="Google Sans" w:hAnsi="Google Sans" w:cs="Google Sans"/>
+          <w:color w:val="1F1F1F"/>
+        </w:rPr>
+      </w:pPr>
+    </w:p>
+    <w:p>
+      <w:pPr>
+        <w:pBdr>
+          <w:top w:val="nil"/>
+          <w:left w:val="nil"/>
+          <w:bottom w:val="nil"/>
+          <w:right w:val="nil"/>
+          <w:between w:val="nil"/>
+        </w:pBdr>
+        <w:spacing w:line="275" w:lineRule="auto"/>
+        <w:rPr>
+          <w:rFonts w:ascii="Google Sans" w:eastAsia="Google Sans" w:hAnsi="Google Sans" w:cs="Google Sans"/>
+          <w:color w:val="1F1F1F"/>
+        </w:rPr>
+      </w:pPr>
+    </w:p>
+    <w:p>
+      <w:pPr>
+        <w:pBdr>
+          <w:top w:val="nil"/>
+          <w:left w:val="nil"/>
+          <w:bottom w:val="nil"/>
+          <w:right w:val="nil"/>
+          <w:between w:val="nil"/>
+        </w:pBdr>
+        <w:spacing w:line="275" w:lineRule="auto"/>
+        <w:rPr>
+          <w:rFonts w:ascii="Google Sans" w:eastAsia="Google Sans" w:hAnsi="Google Sans" w:cs="Google Sans"/>
+          <w:color w:val="1F1F1F"/>
+        </w:rPr>
+      </w:pPr>
+    </w:p>
+    <w:p>
+      <w:pPr>
+        <w:pBdr>
+          <w:top w:val="nil"/>
+          <w:left w:val="nil"/>
+          <w:bottom w:val="nil"/>
+          <w:right w:val="nil"/>
+          <w:between w:val="nil"/>
+        </w:pBdr>
+        <w:spacing w:line="275" w:lineRule="auto"/>
+        <w:rPr>
+          <w:rFonts w:ascii="Google Sans" w:eastAsia="Google Sans" w:hAnsi="Google Sans" w:cs="Google Sans"/>
+          <w:color w:val="1F1F1F"/>
+        </w:rPr>
+      </w:pPr>
+    </w:p>
+    <w:p>
+      <w:pPr>
+        <w:pBdr>
+          <w:top w:val="nil"/>
+          <w:left w:val="nil"/>
+          <w:bottom w:val="nil"/>
+          <w:right w:val="nil"/>
+          <w:between w:val="nil"/>
+        </w:pBdr>
+        <w:spacing w:line="275" w:lineRule="auto"/>
+        <w:rPr>
+          <w:rFonts w:ascii="Google Sans" w:eastAsia="Google Sans" w:hAnsi="Google Sans" w:cs="Google Sans"/>
+          <w:color w:val="1F1F1F"/>
+        </w:rPr>
+      </w:pPr>
+    </w:p>
+    <w:p>
+      <w:pPr>
+        <w:pBdr>
+          <w:top w:val="nil"/>
+          <w:left w:val="nil"/>
+          <w:bottom w:val="nil"/>
+          <w:right w:val="nil"/>
+          <w:between w:val="nil"/>
+        </w:pBdr>
+        <w:spacing w:line="275" w:lineRule="auto"/>
+        <w:rPr>
+          <w:rFonts w:ascii="Google Sans" w:eastAsia="Google Sans" w:hAnsi="Google Sans" w:cs="Google Sans"/>
+          <w:color w:val="1F1F1F"/>
+        </w:rPr>
+      </w:pPr>
+    </w:p>
+    <w:p>
+      <w:pPr>
+        <w:pBdr>
+          <w:top w:val="nil"/>
+          <w:left w:val="nil"/>
+          <w:bottom w:val="nil"/>
+          <w:right w:val="nil"/>
+          <w:between w:val="nil"/>
+        </w:pBdr>
+        <w:spacing w:line="275" w:lineRule="auto"/>
+        <w:rPr>
+          <w:rFonts w:ascii="Google Sans" w:eastAsia="Google Sans" w:hAnsi="Google Sans" w:cs="Google Sans"/>
+          <w:color w:val="1F1F1F"/>
+        </w:rPr>
+      </w:pPr>
+    </w:p>
+    <w:p>
+      <w:pPr>
+        <w:pBdr>
+          <w:top w:val="nil"/>
+          <w:left w:val="nil"/>
+          <w:bottom w:val="nil"/>
+          <w:right w:val="nil"/>
+          <w:between w:val="nil"/>
+        </w:pBdr>
+        <w:spacing w:line="275" w:lineRule="auto"/>
+      </w:pPr>
+    </w:p>
+    <w:p>
+      <w:pPr>
+        <w:pBdr>
+          <w:top w:val="nil"/>
+          <w:left w:val="nil"/>
+          <w:bottom w:val="nil"/>
+          <w:right w:val="nil"/>
+          <w:between w:val="nil"/>
+        </w:pBdr>
+        <w:spacing w:line="275" w:lineRule="auto"/>
+      </w:pPr>
+    </w:p>
+    <w:p>
+      <w:pPr>
+        <w:pBdr>
+          <w:top w:val="nil"/>
+          <w:left w:val="nil"/>
+          <w:bottom w:val="nil"/>
+          <w:right w:val="nil"/>
+          <w:between w:val="nil"/>
+        </w:pBdr>
+        <w:spacing w:line="275" w:lineRule="auto"/>
       </w:pPr>
     </w:p>
     <w:p>
@@ -1607,7 +1662,6 @@
           <w:between w:val="nil"/>
         </w:pBdr>
         <w:spacing w:line="275" w:lineRule="auto"/>
-        <w:ind w:left="590"/>
       </w:pPr>
     </w:p>
     <w:p>
@@ -1976,7 +2030,7 @@
 </file>
 
 <file path=word/numbering.xml><?xml version="1.0" encoding="utf-8"?>
-<w:numbering xmlns:wpc="http://schemas.microsoft.com/office/word/2010/wordprocessingCanvas" xmlns:cx="http://schemas.microsoft.com/office/drawing/2014/chartex" xmlns:cx1="http://schemas.microsoft.com/office/drawing/2015/9/8/chartex" xmlns:cx2="http://schemas.microsoft.com/office/drawing/2015/10/21/chartex" xmlns:cx3="http://schemas.microsoft.com/office/drawing/2016/5/9/chartex" xmlns:cx4="http://schemas.microsoft.com/office/drawing/2016/5/10/chartex" xmlns:cx5="http://schemas.microsoft.com/office/drawing/2016/5/11/chartex" xmlns:cx6="http://schemas.microsoft.com/office/drawing/2016/5/12/chartex" xmlns:cx7="http://schemas.microsoft.com/office/drawing/2016/5/13/chartex" xmlns:cx8="http://schemas.microsoft.com/office/drawing/2016/5/14/chartex" xmlns:mc="http://schemas.openxmlformats.org/markup-compatibility/2006" xmlns:aink="http://schemas.microsoft.com/office/drawing/2016/ink" xmlns:am3d="http://schemas.microsoft.com/office/drawing/2017/model3d" xmlns:o="urn:schemas-microsoft-com:office:office" xmlns:oel="http://schemas.microsoft.com/office/2019/extlst" xmlns:r="http://schemas.openxmlformats.org/officeDocument/2006/relationships" xmlns:m="http://schemas.openxmlformats.org/officeDocument/2006/math" xmlns:v="urn:schemas-microsoft-com:vml" xmlns:wp14="http://schemas.microsoft.com/office/word/2010/wordprocessingDrawing" xmlns:wp="http://schemas.openxmlformats.org/drawingml/2006/wordprocessingDrawing" xmlns:w10="urn:schemas-microsoft-com:office:word" xmlns:w="http://schemas.openxmlformats.org/wordprocessingml/2006/main" xmlns:w14="http://schemas.microsoft.com/office/word/2010/wordml" xmlns:w15="http://schemas.microsoft.com/office/word/2012/wordml" xmlns:w16cei="http://schemas.microsoft.com/office/word/2026/wordml/cei" xmlns:w16cex="http://schemas.microsoft.com/office/word/2018/wordml/cex" xmlns:w16cid="http://schemas.microsoft.com/office/word/2016/wordml/cid" xmlns:w16="http://schemas.microsoft.com/office/word/2018/wordml" xmlns:w16du="http://schemas.microsoft.com/office/word/2023/wordml/word16du" xmlns:w16sdtdh="http://schemas.microsoft.com/office/word/2020/wordml/sdtdatahash" xmlns:w16sdtfl="http://schemas.microsoft.com/office/word/2024/wordml/sdtformatlock" xmlns:w16se="http://schemas.microsoft.com/office/word/2015/wordml/symex" xmlns:wpg="http://schemas.microsoft.com/office/word/2010/wordprocessingGroup" xmlns:wpi="http://schemas.microsoft.com/office/word/2010/wordprocessingInk" xmlns:wne="http://schemas.microsoft.com/office/word/2006/wordml" xmlns:wps="http://schemas.microsoft.com/office/word/2010/wordprocessingShape" mc:Ignorable="w14 w15 w16se w16cid w16 w16cex w16sdtdh w16sdtfl w16du wp14">
+<w:numbering xmlns:wpc="http://schemas.microsoft.com/office/word/2010/wordprocessingCanvas" xmlns:cx="http://schemas.microsoft.com/office/drawing/2014/chartex" xmlns:cx1="http://schemas.microsoft.com/office/drawing/2015/9/8/chartex" xmlns:cx2="http://schemas.microsoft.com/office/drawing/2015/10/21/chartex" xmlns:cx3="http://schemas.microsoft.com/office/drawing/2016/5/9/chartex" xmlns:cx4="http://schemas.microsoft.com/office/drawing/2016/5/10/chartex" xmlns:cx5="http://schemas.microsoft.com/office/drawing/2016/5/11/chartex" xmlns:cx6="http://schemas.microsoft.com/office/drawing/2016/5/12/chartex" xmlns:cx7="http://schemas.microsoft.com/office/drawing/2016/5/13/chartex" xmlns:cx8="http://schemas.microsoft.com/office/drawing/2016/5/14/chartex" xmlns:mc="http://schemas.openxmlformats.org/markup-compatibility/2006" xmlns:aink="http://schemas.microsoft.com/office/drawing/2016/ink" xmlns:am3d="http://schemas.microsoft.com/office/drawing/2017/model3d" xmlns:o="urn:schemas-microsoft-com:office:office" xmlns:oel="http://schemas.microsoft.com/office/2019/extlst" xmlns:r="http://schemas.openxmlformats.org/officeDocument/2006/relationships" xmlns:m="http://schemas.openxmlformats.org/officeDocument/2006/math" xmlns:v="urn:schemas-microsoft-com:vml" xmlns:wp14="http://schemas.microsoft.com/office/word/2010/wordprocessingDrawing" xmlns:wp="http://schemas.openxmlformats.org/drawingml/2006/wordprocessingDrawing" xmlns:w10="urn:schemas-microsoft-com:office:word" xmlns:w="http://schemas.openxmlformats.org/wordprocessingml/2006/main" xmlns:w14="http://schemas.microsoft.com/office/word/2010/wordml" xmlns:w15="http://schemas.microsoft.com/office/word/2012/wordml" xmlns:w16cex="http://schemas.microsoft.com/office/word/2018/wordml/cex" xmlns:w16cid="http://schemas.microsoft.com/office/word/2016/wordml/cid" xmlns:w16="http://schemas.microsoft.com/office/word/2018/wordml" xmlns:w16du="http://schemas.microsoft.com/office/word/2023/wordml/word16du" xmlns:w16sdtdh="http://schemas.microsoft.com/office/word/2020/wordml/sdtdatahash" xmlns:w16sdtfl="http://schemas.microsoft.com/office/word/2024/wordml/sdtformatlock" xmlns:w16se="http://schemas.microsoft.com/office/word/2015/wordml/symex" xmlns:wpg="http://schemas.microsoft.com/office/word/2010/wordprocessingGroup" xmlns:wpi="http://schemas.microsoft.com/office/word/2010/wordprocessingInk" xmlns:wne="http://schemas.microsoft.com/office/word/2006/wordml" xmlns:wps="http://schemas.microsoft.com/office/word/2010/wordprocessingShape" mc:Ignorable="w14 w15 w16se w16cid w16 w16cex w16sdtdh w16sdtfl w16du wp14">
   <w:abstractNum w:abstractNumId="0" w15:restartNumberingAfterBreak="0">
     <w:nsid w:val="030514F9"/>
     <w:multiLevelType w:val="multilevel"/>

</xml_diff>

<commit_message>
some minor updates pushed
</commit_message>
<xml_diff>
--- a/public/Resume.docx
+++ b/public/Resume.docx
@@ -1070,7 +1070,7 @@
           <w:rFonts w:ascii="Google Sans" w:eastAsia="Google Sans" w:hAnsi="Google Sans" w:cs="Google Sans"/>
           <w:color w:val="1F1F1F"/>
         </w:rPr>
-        <w:t>Daisy Weather Web</w:t>
+        <w:t>Daisy Weather app</w:t>
       </w:r>
     </w:p>
     <w:p>
@@ -1166,11 +1166,24 @@
           <w:between w:val="nil"/>
         </w:pBdr>
         <w:spacing w:line="275" w:lineRule="auto"/>
-        <w:rPr>
-          <w:rFonts w:ascii="Google Sans" w:eastAsia="Google Sans" w:hAnsi="Google Sans" w:cs="Google Sans"/>
-          <w:color w:val="1F1F1F"/>
-        </w:rPr>
-      </w:pPr>
+      </w:pPr>
+    </w:p>
+    <w:p>
+      <w:pPr>
+        <w:pStyle w:val="Heading4"/>
+        <w:spacing w:before="0" w:line="275" w:lineRule="auto"/>
+        <w:rPr>
+          <w:rFonts w:ascii="Google Sans" w:eastAsia="Google Sans" w:hAnsi="Google Sans" w:cs="Google Sans"/>
+          <w:color w:val="1F1F1F"/>
+        </w:rPr>
+      </w:pPr>
+      <w:r>
+        <w:rPr>
+          <w:rFonts w:ascii="Google Sans" w:eastAsia="Google Sans" w:hAnsi="Google Sans" w:cs="Google Sans"/>
+          <w:color w:val="1F1F1F"/>
+        </w:rPr>
+        <w:t>Enhanced directory view</w:t>
+      </w:r>
     </w:p>
     <w:p>
       <w:pPr>
@@ -1184,12 +1197,43 @@
         <w:spacing w:line="275" w:lineRule="auto"/>
         <w:rPr>
           <w:rFonts w:ascii="Google Sans" w:eastAsia="Google Sans" w:hAnsi="Google Sans" w:cs="Google Sans"/>
-          <w:color w:val="1F1F1F"/>
-        </w:rPr>
-      </w:pPr>
-    </w:p>
-    <w:p>
-      <w:pPr>
+          <w:color w:val="1155CC"/>
+          <w:u w:val="single"/>
+        </w:rPr>
+      </w:pPr>
+      <w:r>
+        <w:rPr>
+          <w:rFonts w:ascii="Google Sans" w:eastAsia="Google Sans" w:hAnsi="Google Sans" w:cs="Google Sans"/>
+          <w:i/>
+          <w:iCs/>
+          <w:color w:val="1F1F1F"/>
+        </w:rPr>
+        <w:t>Vite-web-extension, Daisy-UI, Sharp-cli, Tailwind CSS</w:t>
+      </w:r>
+      <w:r>
+        <w:rPr>
+          <w:rFonts w:ascii="Google Sans" w:eastAsia="Google Sans" w:hAnsi="Google Sans" w:cs="Google Sans"/>
+          <w:color w:val="1F1F1F"/>
+        </w:rPr>
+        <w:t xml:space="preserve"> | </w:t>
+      </w:r>
+      <w:hyperlink r:id="rId16">
+        <w:r>
+          <w:rPr>
+            <w:rFonts w:ascii="Google Sans" w:eastAsia="Google Sans" w:hAnsi="Google Sans" w:cs="Google Sans"/>
+            <w:color w:val="1155CC"/>
+            <w:u w:val="single"/>
+          </w:rPr>
+          <w:t>GitHub Repository</w:t>
+        </w:r>
+      </w:hyperlink>
+    </w:p>
+    <w:p>
+      <w:pPr>
+        <w:numPr>
+          <w:ilvl w:val="0"/>
+          <w:numId w:val="6"/>
+        </w:numPr>
         <w:pBdr>
           <w:top w:val="nil"/>
           <w:left w:val="nil"/>
@@ -1198,11 +1242,14 @@
           <w:between w:val="nil"/>
         </w:pBdr>
         <w:spacing w:line="275" w:lineRule="auto"/>
-        <w:rPr>
-          <w:rFonts w:ascii="Google Sans" w:eastAsia="Google Sans" w:hAnsi="Google Sans" w:cs="Google Sans"/>
-          <w:color w:val="1F1F1F"/>
-        </w:rPr>
-      </w:pPr>
+      </w:pPr>
+      <w:r>
+        <w:rPr>
+          <w:rFonts w:ascii="Google Sans" w:eastAsia="Google Sans" w:hAnsi="Google Sans" w:cs="Google Sans"/>
+          <w:color w:val="1F1F1F"/>
+        </w:rPr>
+        <w:t>Developed a browser extension which overrides default outdated directory view of the browser with dedicated dark mode and light mode.</w:t>
+      </w:r>
     </w:p>
     <w:p>
       <w:pPr>
@@ -1222,6 +1269,44 @@
     </w:p>
     <w:p>
       <w:pPr>
+        <w:pStyle w:val="Heading4"/>
+        <w:spacing w:before="0" w:line="275" w:lineRule="auto"/>
+        <w:rPr>
+          <w:rFonts w:ascii="Google Sans" w:eastAsia="Google Sans" w:hAnsi="Google Sans" w:cs="Google Sans"/>
+          <w:color w:val="1F1F1F"/>
+        </w:rPr>
+      </w:pPr>
+      <w:r>
+        <w:rPr>
+          <w:rFonts w:ascii="Google Sans" w:eastAsia="Google Sans" w:hAnsi="Google Sans" w:cs="Google Sans"/>
+          <w:color w:val="1F1F1F"/>
+        </w:rPr>
+        <w:t>Site</w:t>
+      </w:r>
+      <w:r>
+        <w:rPr>
+          <w:rFonts w:ascii="Google Sans" w:eastAsia="Google Sans" w:hAnsi="Google Sans" w:cs="Google Sans"/>
+          <w:color w:val="1F1F1F"/>
+        </w:rPr>
+        <w:t xml:space="preserve"> </w:t>
+      </w:r>
+      <w:r>
+        <w:rPr>
+          <w:rFonts w:ascii="Google Sans" w:eastAsia="Google Sans" w:hAnsi="Google Sans" w:cs="Google Sans"/>
+          <w:color w:val="1F1F1F"/>
+        </w:rPr>
+        <w:t>Blocker</w:t>
+      </w:r>
+      <w:r>
+        <w:rPr>
+          <w:rFonts w:ascii="Google Sans" w:eastAsia="Google Sans" w:hAnsi="Google Sans" w:cs="Google Sans"/>
+          <w:color w:val="1F1F1F"/>
+        </w:rPr>
+        <w:t xml:space="preserve"> </w:t>
+      </w:r>
+    </w:p>
+    <w:p>
+      <w:pPr>
         <w:pBdr>
           <w:top w:val="nil"/>
           <w:left w:val="nil"/>
@@ -1232,7 +1317,159 @@
         <w:spacing w:line="275" w:lineRule="auto"/>
         <w:rPr>
           <w:rFonts w:ascii="Google Sans" w:eastAsia="Google Sans" w:hAnsi="Google Sans" w:cs="Google Sans"/>
-          <w:color w:val="1F1F1F"/>
+          <w:color w:val="1155CC"/>
+          <w:u w:val="single"/>
+        </w:rPr>
+      </w:pPr>
+      <w:r>
+        <w:rPr>
+          <w:rFonts w:ascii="Google Sans" w:eastAsia="Google Sans" w:hAnsi="Google Sans" w:cs="Google Sans"/>
+          <w:i/>
+          <w:iCs/>
+          <w:color w:val="1F1F1F"/>
+        </w:rPr>
+        <w:t xml:space="preserve">React, </w:t>
+      </w:r>
+      <w:r>
+        <w:rPr>
+          <w:rFonts w:ascii="Google Sans" w:eastAsia="Google Sans" w:hAnsi="Google Sans" w:cs="Google Sans"/>
+          <w:i/>
+          <w:iCs/>
+          <w:color w:val="1F1F1F"/>
+        </w:rPr>
+        <w:t xml:space="preserve">Vite-web-extension, </w:t>
+      </w:r>
+      <w:r>
+        <w:rPr>
+          <w:rFonts w:ascii="Google Sans" w:eastAsia="Google Sans" w:hAnsi="Google Sans" w:cs="Google Sans"/>
+          <w:i/>
+          <w:iCs/>
+          <w:color w:val="1F1F1F"/>
+        </w:rPr>
+        <w:t>Material-UI</w:t>
+      </w:r>
+      <w:r>
+        <w:rPr>
+          <w:rFonts w:ascii="Google Sans" w:eastAsia="Google Sans" w:hAnsi="Google Sans" w:cs="Google Sans"/>
+          <w:i/>
+          <w:iCs/>
+          <w:color w:val="1F1F1F"/>
+        </w:rPr>
+        <w:t>, Sharp-cli, Tailwind CSS</w:t>
+      </w:r>
+      <w:r>
+        <w:rPr>
+          <w:rFonts w:ascii="Google Sans" w:eastAsia="Google Sans" w:hAnsi="Google Sans" w:cs="Google Sans"/>
+          <w:color w:val="1F1F1F"/>
+        </w:rPr>
+        <w:t xml:space="preserve"> | </w:t>
+      </w:r>
+      <w:hyperlink r:id="rId17">
+        <w:r>
+          <w:rPr>
+            <w:rFonts w:ascii="Google Sans" w:eastAsia="Google Sans" w:hAnsi="Google Sans" w:cs="Google Sans"/>
+            <w:color w:val="1155CC"/>
+            <w:u w:val="single"/>
+          </w:rPr>
+          <w:t>GitHub Repository</w:t>
+        </w:r>
+      </w:hyperlink>
+    </w:p>
+    <w:p>
+      <w:pPr>
+        <w:numPr>
+          <w:ilvl w:val="0"/>
+          <w:numId w:val="6"/>
+        </w:numPr>
+        <w:pBdr>
+          <w:bottom w:val="nil"/>
+        </w:pBdr>
+        <w:spacing w:line="275" w:lineRule="auto"/>
+        <w:rPr>
+          <w:rFonts w:ascii="Google Sans" w:eastAsia="Google Sans" w:hAnsi="Google Sans" w:cs="Google Sans"/>
+          <w:b/>
+          <w:bCs/>
+          <w:color w:val="1F1F1F"/>
+          <w:lang w:val="en-US"/>
+        </w:rPr>
+      </w:pPr>
+      <w:r>
+        <w:rPr>
+          <w:rFonts w:ascii="Google Sans" w:eastAsia="Google Sans" w:hAnsi="Google Sans" w:cs="Google Sans"/>
+          <w:color w:val="1F1F1F"/>
+          <w:lang w:val="en-US"/>
+        </w:rPr>
+        <w:t>E</w:t>
+      </w:r>
+      <w:r>
+        <w:rPr>
+          <w:rFonts w:ascii="Google Sans" w:eastAsia="Google Sans" w:hAnsi="Google Sans" w:cs="Google Sans"/>
+          <w:color w:val="1F1F1F"/>
+          <w:lang w:val="en-US"/>
+        </w:rPr>
+        <w:t>asy way to block distracting websites to prevent access while you work</w:t>
+      </w:r>
+      <w:r>
+        <w:rPr>
+          <w:rFonts w:ascii="Google Sans" w:eastAsia="Google Sans" w:hAnsi="Google Sans" w:cs="Google Sans"/>
+          <w:color w:val="1F1F1F"/>
+          <w:lang w:val="en-US"/>
+        </w:rPr>
+        <w:t xml:space="preserve"> </w:t>
+      </w:r>
+      <w:r>
+        <w:rPr>
+          <w:rFonts w:ascii="Google Sans" w:eastAsia="Google Sans" w:hAnsi="Google Sans" w:cs="Google Sans"/>
+          <w:color w:val="1F1F1F"/>
+        </w:rPr>
+        <w:t>.</w:t>
+      </w:r>
+    </w:p>
+    <w:p>
+      <w:pPr>
+        <w:numPr>
+          <w:ilvl w:val="0"/>
+          <w:numId w:val="6"/>
+        </w:numPr>
+        <w:pBdr>
+          <w:bottom w:val="nil"/>
+        </w:pBdr>
+        <w:spacing w:line="275" w:lineRule="auto"/>
+        <w:rPr>
+          <w:rFonts w:ascii="Google Sans" w:eastAsia="Google Sans" w:hAnsi="Google Sans" w:cs="Google Sans"/>
+          <w:b/>
+          <w:bCs/>
+          <w:color w:val="1F1F1F"/>
+          <w:lang w:val="en-US"/>
+        </w:rPr>
+      </w:pPr>
+      <w:r>
+        <w:rPr>
+          <w:rFonts w:ascii="Google Sans" w:eastAsia="Google Sans" w:hAnsi="Google Sans" w:cs="Google Sans"/>
+          <w:color w:val="1F1F1F"/>
+        </w:rPr>
+        <w:t>Based on react, material-ui, typescript, uses chromes-</w:t>
+      </w:r>
+      <w:r>
+        <w:rPr>
+          <w:rFonts w:ascii="Google Sans" w:eastAsia="Google Sans" w:hAnsi="Google Sans" w:cs="Google Sans"/>
+          <w:color w:val="1F1F1F"/>
+        </w:rPr>
+        <w:t>API</w:t>
+      </w:r>
+    </w:p>
+    <w:p>
+      <w:pPr>
+        <w:pBdr>
+          <w:bottom w:val="nil"/>
+        </w:pBdr>
+        <w:spacing w:line="275" w:lineRule="auto"/>
+        <w:rPr>
+          <w:rFonts w:ascii="Google Sans" w:eastAsia="Google Sans" w:hAnsi="Google Sans" w:cs="Google Sans"/>
+          <w:b/>
+          <w:bCs/>
+          <w:color w:val="1F1F1F"/>
+          <w:lang w:val="en-US"/>
         </w:rPr>
       </w:pPr>
     </w:p>
@@ -1250,122 +1487,6 @@
           <w:rFonts w:ascii="Google Sans" w:eastAsia="Google Sans" w:hAnsi="Google Sans" w:cs="Google Sans"/>
           <w:color w:val="1F1F1F"/>
         </w:rPr>
-      </w:pPr>
-    </w:p>
-    <w:p>
-      <w:pPr>
-        <w:pBdr>
-          <w:top w:val="nil"/>
-          <w:left w:val="nil"/>
-          <w:bottom w:val="nil"/>
-          <w:right w:val="nil"/>
-          <w:between w:val="nil"/>
-        </w:pBdr>
-        <w:spacing w:line="275" w:lineRule="auto"/>
-        <w:rPr>
-          <w:rFonts w:ascii="Google Sans" w:eastAsia="Google Sans" w:hAnsi="Google Sans" w:cs="Google Sans"/>
-          <w:color w:val="1F1F1F"/>
-        </w:rPr>
-      </w:pPr>
-    </w:p>
-    <w:p>
-      <w:pPr>
-        <w:pBdr>
-          <w:top w:val="nil"/>
-          <w:left w:val="nil"/>
-          <w:bottom w:val="nil"/>
-          <w:right w:val="nil"/>
-          <w:between w:val="nil"/>
-        </w:pBdr>
-        <w:spacing w:line="275" w:lineRule="auto"/>
-        <w:rPr>
-          <w:rFonts w:ascii="Google Sans" w:eastAsia="Google Sans" w:hAnsi="Google Sans" w:cs="Google Sans"/>
-          <w:color w:val="1F1F1F"/>
-        </w:rPr>
-      </w:pPr>
-    </w:p>
-    <w:p>
-      <w:pPr>
-        <w:pBdr>
-          <w:top w:val="nil"/>
-          <w:left w:val="nil"/>
-          <w:bottom w:val="nil"/>
-          <w:right w:val="nil"/>
-          <w:between w:val="nil"/>
-        </w:pBdr>
-        <w:spacing w:line="275" w:lineRule="auto"/>
-        <w:rPr>
-          <w:rFonts w:ascii="Google Sans" w:eastAsia="Google Sans" w:hAnsi="Google Sans" w:cs="Google Sans"/>
-          <w:color w:val="1F1F1F"/>
-        </w:rPr>
-      </w:pPr>
-    </w:p>
-    <w:p>
-      <w:pPr>
-        <w:pBdr>
-          <w:top w:val="nil"/>
-          <w:left w:val="nil"/>
-          <w:bottom w:val="nil"/>
-          <w:right w:val="nil"/>
-          <w:between w:val="nil"/>
-        </w:pBdr>
-        <w:spacing w:line="275" w:lineRule="auto"/>
-        <w:rPr>
-          <w:rFonts w:ascii="Google Sans" w:eastAsia="Google Sans" w:hAnsi="Google Sans" w:cs="Google Sans"/>
-          <w:color w:val="1F1F1F"/>
-        </w:rPr>
-      </w:pPr>
-    </w:p>
-    <w:p>
-      <w:pPr>
-        <w:pBdr>
-          <w:top w:val="nil"/>
-          <w:left w:val="nil"/>
-          <w:bottom w:val="nil"/>
-          <w:right w:val="nil"/>
-          <w:between w:val="nil"/>
-        </w:pBdr>
-        <w:spacing w:line="275" w:lineRule="auto"/>
-        <w:rPr>
-          <w:rFonts w:ascii="Google Sans" w:eastAsia="Google Sans" w:hAnsi="Google Sans" w:cs="Google Sans"/>
-          <w:color w:val="1F1F1F"/>
-        </w:rPr>
-      </w:pPr>
-    </w:p>
-    <w:p>
-      <w:pPr>
-        <w:pBdr>
-          <w:top w:val="nil"/>
-          <w:left w:val="nil"/>
-          <w:bottom w:val="nil"/>
-          <w:right w:val="nil"/>
-          <w:between w:val="nil"/>
-        </w:pBdr>
-        <w:spacing w:line="275" w:lineRule="auto"/>
-      </w:pPr>
-    </w:p>
-    <w:p>
-      <w:pPr>
-        <w:pBdr>
-          <w:top w:val="nil"/>
-          <w:left w:val="nil"/>
-          <w:bottom w:val="nil"/>
-          <w:right w:val="nil"/>
-          <w:between w:val="nil"/>
-        </w:pBdr>
-        <w:spacing w:line="275" w:lineRule="auto"/>
-      </w:pPr>
-    </w:p>
-    <w:p>
-      <w:pPr>
-        <w:pBdr>
-          <w:top w:val="nil"/>
-          <w:left w:val="nil"/>
-          <w:bottom w:val="nil"/>
-          <w:right w:val="nil"/>
-          <w:between w:val="nil"/>
-        </w:pBdr>
-        <w:spacing w:line="275" w:lineRule="auto"/>
       </w:pPr>
     </w:p>
     <w:p>
@@ -1712,7 +1833,7 @@
         </w:rPr>
         <w:t xml:space="preserve"> - </w:t>
       </w:r>
-      <w:hyperlink r:id="rId16">
+      <w:hyperlink r:id="rId18">
         <w:r>
           <w:rPr>
             <w:rFonts w:ascii="Google Sans" w:eastAsia="Google Sans" w:hAnsi="Google Sans" w:cs="Google Sans"/>
@@ -1754,97 +1875,6 @@
           <w:color w:val="1F1F1F"/>
         </w:rPr>
         <w:t xml:space="preserve"> - </w:t>
-      </w:r>
-      <w:hyperlink r:id="rId17">
-        <w:r>
-          <w:rPr>
-            <w:rFonts w:ascii="Google Sans" w:eastAsia="Google Sans" w:hAnsi="Google Sans" w:cs="Google Sans"/>
-            <w:color w:val="1155CC"/>
-            <w:u w:val="single"/>
-          </w:rPr>
-          <w:t>Coursera</w:t>
-        </w:r>
-      </w:hyperlink>
-    </w:p>
-    <w:p>
-      <w:pPr>
-        <w:numPr>
-          <w:ilvl w:val="0"/>
-          <w:numId w:val="8"/>
-        </w:numPr>
-        <w:pBdr>
-          <w:top w:val="nil"/>
-          <w:left w:val="nil"/>
-          <w:bottom w:val="nil"/>
-          <w:right w:val="nil"/>
-          <w:between w:val="nil"/>
-        </w:pBdr>
-        <w:spacing w:line="275" w:lineRule="auto"/>
-      </w:pPr>
-      <w:r>
-        <w:rPr>
-          <w:rFonts w:ascii="Google Sans" w:eastAsia="Google Sans" w:hAnsi="Google Sans" w:cs="Google Sans"/>
-          <w:b/>
-          <w:bCs/>
-          <w:color w:val="1F1F1F"/>
-        </w:rPr>
-        <w:t>Django Web Framework</w:t>
-      </w:r>
-      <w:r>
-        <w:rPr>
-          <w:rFonts w:ascii="Google Sans" w:eastAsia="Google Sans" w:hAnsi="Google Sans" w:cs="Google Sans"/>
-          <w:color w:val="1F1F1F"/>
-        </w:rPr>
-        <w:t xml:space="preserve"> - </w:t>
-      </w:r>
-      <w:hyperlink r:id="rId18">
-        <w:r>
-          <w:rPr>
-            <w:rFonts w:ascii="Google Sans" w:eastAsia="Google Sans" w:hAnsi="Google Sans" w:cs="Google Sans"/>
-            <w:color w:val="1155CC"/>
-            <w:u w:val="single"/>
-          </w:rPr>
-          <w:t>Ardent</w:t>
-        </w:r>
-      </w:hyperlink>
-    </w:p>
-    <w:p>
-      <w:pPr>
-        <w:numPr>
-          <w:ilvl w:val="0"/>
-          <w:numId w:val="8"/>
-        </w:numPr>
-        <w:pBdr>
-          <w:top w:val="nil"/>
-          <w:left w:val="nil"/>
-          <w:bottom w:val="nil"/>
-          <w:right w:val="nil"/>
-          <w:between w:val="nil"/>
-        </w:pBdr>
-        <w:spacing w:line="275" w:lineRule="auto"/>
-      </w:pPr>
-      <w:r>
-        <w:rPr>
-          <w:rFonts w:ascii="Google Sans" w:eastAsia="Google Sans" w:hAnsi="Google Sans" w:cs="Google Sans"/>
-          <w:b/>
-          <w:bCs/>
-          <w:color w:val="1F1F1F"/>
-        </w:rPr>
-        <w:t>Approximation Algorithms</w:t>
-      </w:r>
-      <w:r>
-        <w:rPr>
-          <w:rFonts w:ascii="Google Sans" w:eastAsia="Google Sans" w:hAnsi="Google Sans" w:cs="Google Sans"/>
-          <w:color w:val="1F1F1F"/>
-        </w:rPr>
-        <w:t xml:space="preserve"> -</w:t>
-      </w:r>
-      <w:r>
-        <w:rPr>
-          <w:rFonts w:ascii="Google Sans" w:eastAsia="Google Sans" w:hAnsi="Google Sans" w:cs="Google Sans"/>
-          <w:color w:val="1F1F1F"/>
-        </w:rPr>
-        <w:t xml:space="preserve"> </w:t>
       </w:r>
       <w:hyperlink r:id="rId19">
         <w:r>
@@ -1879,6 +1909,97 @@
           <w:bCs/>
           <w:color w:val="1F1F1F"/>
         </w:rPr>
+        <w:t>Django Web Framework</w:t>
+      </w:r>
+      <w:r>
+        <w:rPr>
+          <w:rFonts w:ascii="Google Sans" w:eastAsia="Google Sans" w:hAnsi="Google Sans" w:cs="Google Sans"/>
+          <w:color w:val="1F1F1F"/>
+        </w:rPr>
+        <w:t xml:space="preserve"> - </w:t>
+      </w:r>
+      <w:hyperlink r:id="rId20">
+        <w:r>
+          <w:rPr>
+            <w:rFonts w:ascii="Google Sans" w:eastAsia="Google Sans" w:hAnsi="Google Sans" w:cs="Google Sans"/>
+            <w:color w:val="1155CC"/>
+            <w:u w:val="single"/>
+          </w:rPr>
+          <w:t>Ardent</w:t>
+        </w:r>
+      </w:hyperlink>
+    </w:p>
+    <w:p>
+      <w:pPr>
+        <w:numPr>
+          <w:ilvl w:val="0"/>
+          <w:numId w:val="8"/>
+        </w:numPr>
+        <w:pBdr>
+          <w:top w:val="nil"/>
+          <w:left w:val="nil"/>
+          <w:bottom w:val="nil"/>
+          <w:right w:val="nil"/>
+          <w:between w:val="nil"/>
+        </w:pBdr>
+        <w:spacing w:line="275" w:lineRule="auto"/>
+      </w:pPr>
+      <w:r>
+        <w:rPr>
+          <w:rFonts w:ascii="Google Sans" w:eastAsia="Google Sans" w:hAnsi="Google Sans" w:cs="Google Sans"/>
+          <w:b/>
+          <w:bCs/>
+          <w:color w:val="1F1F1F"/>
+        </w:rPr>
+        <w:t>Approximation Algorithms</w:t>
+      </w:r>
+      <w:r>
+        <w:rPr>
+          <w:rFonts w:ascii="Google Sans" w:eastAsia="Google Sans" w:hAnsi="Google Sans" w:cs="Google Sans"/>
+          <w:color w:val="1F1F1F"/>
+        </w:rPr>
+        <w:t xml:space="preserve"> -</w:t>
+      </w:r>
+      <w:r>
+        <w:rPr>
+          <w:rFonts w:ascii="Google Sans" w:eastAsia="Google Sans" w:hAnsi="Google Sans" w:cs="Google Sans"/>
+          <w:color w:val="1F1F1F"/>
+        </w:rPr>
+        <w:t xml:space="preserve"> </w:t>
+      </w:r>
+      <w:hyperlink r:id="rId21">
+        <w:r>
+          <w:rPr>
+            <w:rFonts w:ascii="Google Sans" w:eastAsia="Google Sans" w:hAnsi="Google Sans" w:cs="Google Sans"/>
+            <w:color w:val="1155CC"/>
+            <w:u w:val="single"/>
+          </w:rPr>
+          <w:t>Coursera</w:t>
+        </w:r>
+      </w:hyperlink>
+    </w:p>
+    <w:p>
+      <w:pPr>
+        <w:numPr>
+          <w:ilvl w:val="0"/>
+          <w:numId w:val="8"/>
+        </w:numPr>
+        <w:pBdr>
+          <w:top w:val="nil"/>
+          <w:left w:val="nil"/>
+          <w:bottom w:val="nil"/>
+          <w:right w:val="nil"/>
+          <w:between w:val="nil"/>
+        </w:pBdr>
+        <w:spacing w:line="275" w:lineRule="auto"/>
+      </w:pPr>
+      <w:r>
+        <w:rPr>
+          <w:rFonts w:ascii="Google Sans" w:eastAsia="Google Sans" w:hAnsi="Google Sans" w:cs="Google Sans"/>
+          <w:b/>
+          <w:bCs/>
+          <w:color w:val="1F1F1F"/>
+        </w:rPr>
         <w:t>MongoDB</w:t>
       </w:r>
       <w:r>
@@ -1888,7 +2009,7 @@
         </w:rPr>
         <w:t xml:space="preserve"> – </w:t>
       </w:r>
-      <w:hyperlink r:id="rId20">
+      <w:hyperlink r:id="rId22">
         <w:r>
           <w:rPr>
             <w:rFonts w:ascii="Google Sans" w:eastAsia="Google Sans" w:hAnsi="Google Sans" w:cs="Google Sans"/>
@@ -1923,7 +2044,7 @@
         </w:rPr>
         <w:t xml:space="preserve"> - </w:t>
       </w:r>
-      <w:hyperlink r:id="rId21">
+      <w:hyperlink r:id="rId23">
         <w:r>
           <w:rPr>
             <w:rFonts w:ascii="Google Sans" w:eastAsia="Google Sans" w:hAnsi="Google Sans" w:cs="Google Sans"/>
@@ -1965,7 +2086,7 @@
         </w:rPr>
         <w:t xml:space="preserve"> - </w:t>
       </w:r>
-      <w:hyperlink r:id="rId22">
+      <w:hyperlink r:id="rId24">
         <w:r>
           <w:rPr>
             <w:rFonts w:ascii="Google Sans" w:eastAsia="Google Sans" w:hAnsi="Google Sans" w:cs="Google Sans"/>
@@ -2007,7 +2128,7 @@
         </w:rPr>
         <w:t xml:space="preserve"> - </w:t>
       </w:r>
-      <w:hyperlink r:id="rId23">
+      <w:hyperlink r:id="rId25">
         <w:r>
           <w:rPr>
             <w:rFonts w:ascii="Google Sans" w:eastAsia="Google Sans" w:hAnsi="Google Sans" w:cs="Google Sans"/>
@@ -2253,6 +2374,119 @@
     </w:lvl>
   </w:abstractNum>
   <w:abstractNum w:abstractNumId="1" w15:restartNumberingAfterBreak="0">
+    <w:nsid w:val="1BB5326E"/>
+    <w:multiLevelType w:val="hybridMultilevel"/>
+    <w:tmpl w:val="EC9E081C"/>
+    <w:lvl w:ilvl="0" w:tplc="04090001">
+      <w:start w:val="1"/>
+      <w:numFmt w:val="bullet"/>
+      <w:lvlText w:val=""/>
+      <w:lvlJc w:val="left"/>
+      <w:pPr>
+        <w:ind w:left="720" w:hanging="360"/>
+      </w:pPr>
+      <w:rPr>
+        <w:rFonts w:ascii="Symbol" w:hAnsi="Symbol" w:hint="default"/>
+      </w:rPr>
+    </w:lvl>
+    <w:lvl w:ilvl="1" w:tplc="04090003" w:tentative="1">
+      <w:start w:val="1"/>
+      <w:numFmt w:val="bullet"/>
+      <w:lvlText w:val="o"/>
+      <w:lvlJc w:val="left"/>
+      <w:pPr>
+        <w:ind w:left="1440" w:hanging="360"/>
+      </w:pPr>
+      <w:rPr>
+        <w:rFonts w:ascii="Courier New" w:hAnsi="Courier New" w:cs="Courier New" w:hint="default"/>
+      </w:rPr>
+    </w:lvl>
+    <w:lvl w:ilvl="2" w:tplc="04090005" w:tentative="1">
+      <w:start w:val="1"/>
+      <w:numFmt w:val="bullet"/>
+      <w:lvlText w:val=""/>
+      <w:lvlJc w:val="left"/>
+      <w:pPr>
+        <w:ind w:left="2160" w:hanging="360"/>
+      </w:pPr>
+      <w:rPr>
+        <w:rFonts w:ascii="Wingdings" w:hAnsi="Wingdings" w:hint="default"/>
+      </w:rPr>
+    </w:lvl>
+    <w:lvl w:ilvl="3" w:tplc="04090001" w:tentative="1">
+      <w:start w:val="1"/>
+      <w:numFmt w:val="bullet"/>
+      <w:lvlText w:val=""/>
+      <w:lvlJc w:val="left"/>
+      <w:pPr>
+        <w:ind w:left="2880" w:hanging="360"/>
+      </w:pPr>
+      <w:rPr>
+        <w:rFonts w:ascii="Symbol" w:hAnsi="Symbol" w:hint="default"/>
+      </w:rPr>
+    </w:lvl>
+    <w:lvl w:ilvl="4" w:tplc="04090003" w:tentative="1">
+      <w:start w:val="1"/>
+      <w:numFmt w:val="bullet"/>
+      <w:lvlText w:val="o"/>
+      <w:lvlJc w:val="left"/>
+      <w:pPr>
+        <w:ind w:left="3600" w:hanging="360"/>
+      </w:pPr>
+      <w:rPr>
+        <w:rFonts w:ascii="Courier New" w:hAnsi="Courier New" w:cs="Courier New" w:hint="default"/>
+      </w:rPr>
+    </w:lvl>
+    <w:lvl w:ilvl="5" w:tplc="04090005" w:tentative="1">
+      <w:start w:val="1"/>
+      <w:numFmt w:val="bullet"/>
+      <w:lvlText w:val=""/>
+      <w:lvlJc w:val="left"/>
+      <w:pPr>
+        <w:ind w:left="4320" w:hanging="360"/>
+      </w:pPr>
+      <w:rPr>
+        <w:rFonts w:ascii="Wingdings" w:hAnsi="Wingdings" w:hint="default"/>
+      </w:rPr>
+    </w:lvl>
+    <w:lvl w:ilvl="6" w:tplc="04090001" w:tentative="1">
+      <w:start w:val="1"/>
+      <w:numFmt w:val="bullet"/>
+      <w:lvlText w:val=""/>
+      <w:lvlJc w:val="left"/>
+      <w:pPr>
+        <w:ind w:left="5040" w:hanging="360"/>
+      </w:pPr>
+      <w:rPr>
+        <w:rFonts w:ascii="Symbol" w:hAnsi="Symbol" w:hint="default"/>
+      </w:rPr>
+    </w:lvl>
+    <w:lvl w:ilvl="7" w:tplc="04090003" w:tentative="1">
+      <w:start w:val="1"/>
+      <w:numFmt w:val="bullet"/>
+      <w:lvlText w:val="o"/>
+      <w:lvlJc w:val="left"/>
+      <w:pPr>
+        <w:ind w:left="5760" w:hanging="360"/>
+      </w:pPr>
+      <w:rPr>
+        <w:rFonts w:ascii="Courier New" w:hAnsi="Courier New" w:cs="Courier New" w:hint="default"/>
+      </w:rPr>
+    </w:lvl>
+    <w:lvl w:ilvl="8" w:tplc="04090005" w:tentative="1">
+      <w:start w:val="1"/>
+      <w:numFmt w:val="bullet"/>
+      <w:lvlText w:val=""/>
+      <w:lvlJc w:val="left"/>
+      <w:pPr>
+        <w:ind w:left="6480" w:hanging="360"/>
+      </w:pPr>
+      <w:rPr>
+        <w:rFonts w:ascii="Wingdings" w:hAnsi="Wingdings" w:hint="default"/>
+      </w:rPr>
+    </w:lvl>
+  </w:abstractNum>
+  <w:abstractNum w:abstractNumId="2" w15:restartNumberingAfterBreak="0">
     <w:nsid w:val="1CA06987"/>
     <w:multiLevelType w:val="multilevel"/>
     <w:tmpl w:val="7DB62140"/>
@@ -2473,7 +2707,7 @@
       </w:rPr>
     </w:lvl>
   </w:abstractNum>
-  <w:abstractNum w:abstractNumId="2" w15:restartNumberingAfterBreak="0">
+  <w:abstractNum w:abstractNumId="3" w15:restartNumberingAfterBreak="0">
     <w:nsid w:val="26A36B45"/>
     <w:multiLevelType w:val="multilevel"/>
     <w:tmpl w:val="F104C902"/>
@@ -2694,7 +2928,7 @@
       </w:rPr>
     </w:lvl>
   </w:abstractNum>
-  <w:abstractNum w:abstractNumId="3" w15:restartNumberingAfterBreak="0">
+  <w:abstractNum w:abstractNumId="4" w15:restartNumberingAfterBreak="0">
     <w:nsid w:val="374A5CAA"/>
     <w:multiLevelType w:val="multilevel"/>
     <w:tmpl w:val="8392E7E0"/>
@@ -2915,7 +3149,233 @@
       </w:rPr>
     </w:lvl>
   </w:abstractNum>
-  <w:abstractNum w:abstractNumId="4" w15:restartNumberingAfterBreak="0">
+  <w:abstractNum w:abstractNumId="5" w15:restartNumberingAfterBreak="0">
+    <w:nsid w:val="411A36AC"/>
+    <w:multiLevelType w:val="hybridMultilevel"/>
+    <w:tmpl w:val="0C569632"/>
+    <w:lvl w:ilvl="0" w:tplc="04090001">
+      <w:start w:val="1"/>
+      <w:numFmt w:val="bullet"/>
+      <w:lvlText w:val=""/>
+      <w:lvlJc w:val="left"/>
+      <w:pPr>
+        <w:ind w:left="720" w:hanging="360"/>
+      </w:pPr>
+      <w:rPr>
+        <w:rFonts w:ascii="Symbol" w:hAnsi="Symbol" w:hint="default"/>
+      </w:rPr>
+    </w:lvl>
+    <w:lvl w:ilvl="1" w:tplc="FFFFFFFF" w:tentative="1">
+      <w:start w:val="1"/>
+      <w:numFmt w:val="bullet"/>
+      <w:lvlText w:val="o"/>
+      <w:lvlJc w:val="left"/>
+      <w:pPr>
+        <w:ind w:left="1440" w:hanging="360"/>
+      </w:pPr>
+      <w:rPr>
+        <w:rFonts w:ascii="Courier New" w:hAnsi="Courier New" w:cs="Courier New" w:hint="default"/>
+      </w:rPr>
+    </w:lvl>
+    <w:lvl w:ilvl="2" w:tplc="FFFFFFFF" w:tentative="1">
+      <w:start w:val="1"/>
+      <w:numFmt w:val="bullet"/>
+      <w:lvlText w:val=""/>
+      <w:lvlJc w:val="left"/>
+      <w:pPr>
+        <w:ind w:left="2160" w:hanging="360"/>
+      </w:pPr>
+      <w:rPr>
+        <w:rFonts w:ascii="Wingdings" w:hAnsi="Wingdings" w:hint="default"/>
+      </w:rPr>
+    </w:lvl>
+    <w:lvl w:ilvl="3" w:tplc="FFFFFFFF" w:tentative="1">
+      <w:start w:val="1"/>
+      <w:numFmt w:val="bullet"/>
+      <w:lvlText w:val=""/>
+      <w:lvlJc w:val="left"/>
+      <w:pPr>
+        <w:ind w:left="2880" w:hanging="360"/>
+      </w:pPr>
+      <w:rPr>
+        <w:rFonts w:ascii="Symbol" w:hAnsi="Symbol" w:hint="default"/>
+      </w:rPr>
+    </w:lvl>
+    <w:lvl w:ilvl="4" w:tplc="FFFFFFFF" w:tentative="1">
+      <w:start w:val="1"/>
+      <w:numFmt w:val="bullet"/>
+      <w:lvlText w:val="o"/>
+      <w:lvlJc w:val="left"/>
+      <w:pPr>
+        <w:ind w:left="3600" w:hanging="360"/>
+      </w:pPr>
+      <w:rPr>
+        <w:rFonts w:ascii="Courier New" w:hAnsi="Courier New" w:cs="Courier New" w:hint="default"/>
+      </w:rPr>
+    </w:lvl>
+    <w:lvl w:ilvl="5" w:tplc="FFFFFFFF" w:tentative="1">
+      <w:start w:val="1"/>
+      <w:numFmt w:val="bullet"/>
+      <w:lvlText w:val=""/>
+      <w:lvlJc w:val="left"/>
+      <w:pPr>
+        <w:ind w:left="4320" w:hanging="360"/>
+      </w:pPr>
+      <w:rPr>
+        <w:rFonts w:ascii="Wingdings" w:hAnsi="Wingdings" w:hint="default"/>
+      </w:rPr>
+    </w:lvl>
+    <w:lvl w:ilvl="6" w:tplc="FFFFFFFF" w:tentative="1">
+      <w:start w:val="1"/>
+      <w:numFmt w:val="bullet"/>
+      <w:lvlText w:val=""/>
+      <w:lvlJc w:val="left"/>
+      <w:pPr>
+        <w:ind w:left="5040" w:hanging="360"/>
+      </w:pPr>
+      <w:rPr>
+        <w:rFonts w:ascii="Symbol" w:hAnsi="Symbol" w:hint="default"/>
+      </w:rPr>
+    </w:lvl>
+    <w:lvl w:ilvl="7" w:tplc="FFFFFFFF" w:tentative="1">
+      <w:start w:val="1"/>
+      <w:numFmt w:val="bullet"/>
+      <w:lvlText w:val="o"/>
+      <w:lvlJc w:val="left"/>
+      <w:pPr>
+        <w:ind w:left="5760" w:hanging="360"/>
+      </w:pPr>
+      <w:rPr>
+        <w:rFonts w:ascii="Courier New" w:hAnsi="Courier New" w:cs="Courier New" w:hint="default"/>
+      </w:rPr>
+    </w:lvl>
+    <w:lvl w:ilvl="8" w:tplc="FFFFFFFF" w:tentative="1">
+      <w:start w:val="1"/>
+      <w:numFmt w:val="bullet"/>
+      <w:lvlText w:val=""/>
+      <w:lvlJc w:val="left"/>
+      <w:pPr>
+        <w:ind w:left="6480" w:hanging="360"/>
+      </w:pPr>
+      <w:rPr>
+        <w:rFonts w:ascii="Wingdings" w:hAnsi="Wingdings" w:hint="default"/>
+      </w:rPr>
+    </w:lvl>
+  </w:abstractNum>
+  <w:abstractNum w:abstractNumId="6" w15:restartNumberingAfterBreak="0">
+    <w:nsid w:val="43235A70"/>
+    <w:multiLevelType w:val="hybridMultilevel"/>
+    <w:tmpl w:val="8A545332"/>
+    <w:lvl w:ilvl="0" w:tplc="04090001">
+      <w:start w:val="1"/>
+      <w:numFmt w:val="bullet"/>
+      <w:lvlText w:val=""/>
+      <w:lvlJc w:val="left"/>
+      <w:pPr>
+        <w:ind w:left="720" w:hanging="360"/>
+      </w:pPr>
+      <w:rPr>
+        <w:rFonts w:ascii="Symbol" w:hAnsi="Symbol" w:hint="default"/>
+      </w:rPr>
+    </w:lvl>
+    <w:lvl w:ilvl="1" w:tplc="04090003" w:tentative="1">
+      <w:start w:val="1"/>
+      <w:numFmt w:val="bullet"/>
+      <w:lvlText w:val="o"/>
+      <w:lvlJc w:val="left"/>
+      <w:pPr>
+        <w:ind w:left="1440" w:hanging="360"/>
+      </w:pPr>
+      <w:rPr>
+        <w:rFonts w:ascii="Courier New" w:hAnsi="Courier New" w:cs="Courier New" w:hint="default"/>
+      </w:rPr>
+    </w:lvl>
+    <w:lvl w:ilvl="2" w:tplc="04090005" w:tentative="1">
+      <w:start w:val="1"/>
+      <w:numFmt w:val="bullet"/>
+      <w:lvlText w:val=""/>
+      <w:lvlJc w:val="left"/>
+      <w:pPr>
+        <w:ind w:left="2160" w:hanging="360"/>
+      </w:pPr>
+      <w:rPr>
+        <w:rFonts w:ascii="Wingdings" w:hAnsi="Wingdings" w:hint="default"/>
+      </w:rPr>
+    </w:lvl>
+    <w:lvl w:ilvl="3" w:tplc="04090001" w:tentative="1">
+      <w:start w:val="1"/>
+      <w:numFmt w:val="bullet"/>
+      <w:lvlText w:val=""/>
+      <w:lvlJc w:val="left"/>
+      <w:pPr>
+        <w:ind w:left="2880" w:hanging="360"/>
+      </w:pPr>
+      <w:rPr>
+        <w:rFonts w:ascii="Symbol" w:hAnsi="Symbol" w:hint="default"/>
+      </w:rPr>
+    </w:lvl>
+    <w:lvl w:ilvl="4" w:tplc="04090003" w:tentative="1">
+      <w:start w:val="1"/>
+      <w:numFmt w:val="bullet"/>
+      <w:lvlText w:val="o"/>
+      <w:lvlJc w:val="left"/>
+      <w:pPr>
+        <w:ind w:left="3600" w:hanging="360"/>
+      </w:pPr>
+      <w:rPr>
+        <w:rFonts w:ascii="Courier New" w:hAnsi="Courier New" w:cs="Courier New" w:hint="default"/>
+      </w:rPr>
+    </w:lvl>
+    <w:lvl w:ilvl="5" w:tplc="04090005" w:tentative="1">
+      <w:start w:val="1"/>
+      <w:numFmt w:val="bullet"/>
+      <w:lvlText w:val=""/>
+      <w:lvlJc w:val="left"/>
+      <w:pPr>
+        <w:ind w:left="4320" w:hanging="360"/>
+      </w:pPr>
+      <w:rPr>
+        <w:rFonts w:ascii="Wingdings" w:hAnsi="Wingdings" w:hint="default"/>
+      </w:rPr>
+    </w:lvl>
+    <w:lvl w:ilvl="6" w:tplc="04090001" w:tentative="1">
+      <w:start w:val="1"/>
+      <w:numFmt w:val="bullet"/>
+      <w:lvlText w:val=""/>
+      <w:lvlJc w:val="left"/>
+      <w:pPr>
+        <w:ind w:left="5040" w:hanging="360"/>
+      </w:pPr>
+      <w:rPr>
+        <w:rFonts w:ascii="Symbol" w:hAnsi="Symbol" w:hint="default"/>
+      </w:rPr>
+    </w:lvl>
+    <w:lvl w:ilvl="7" w:tplc="04090003" w:tentative="1">
+      <w:start w:val="1"/>
+      <w:numFmt w:val="bullet"/>
+      <w:lvlText w:val="o"/>
+      <w:lvlJc w:val="left"/>
+      <w:pPr>
+        <w:ind w:left="5760" w:hanging="360"/>
+      </w:pPr>
+      <w:rPr>
+        <w:rFonts w:ascii="Courier New" w:hAnsi="Courier New" w:cs="Courier New" w:hint="default"/>
+      </w:rPr>
+    </w:lvl>
+    <w:lvl w:ilvl="8" w:tplc="04090005" w:tentative="1">
+      <w:start w:val="1"/>
+      <w:numFmt w:val="bullet"/>
+      <w:lvlText w:val=""/>
+      <w:lvlJc w:val="left"/>
+      <w:pPr>
+        <w:ind w:left="6480" w:hanging="360"/>
+      </w:pPr>
+      <w:rPr>
+        <w:rFonts w:ascii="Wingdings" w:hAnsi="Wingdings" w:hint="default"/>
+      </w:rPr>
+    </w:lvl>
+  </w:abstractNum>
+  <w:abstractNum w:abstractNumId="7" w15:restartNumberingAfterBreak="0">
     <w:nsid w:val="4C5652C5"/>
     <w:multiLevelType w:val="multilevel"/>
     <w:tmpl w:val="430A4C36"/>
@@ -3136,7 +3596,7 @@
       </w:rPr>
     </w:lvl>
   </w:abstractNum>
-  <w:abstractNum w:abstractNumId="5" w15:restartNumberingAfterBreak="0">
+  <w:abstractNum w:abstractNumId="8" w15:restartNumberingAfterBreak="0">
     <w:nsid w:val="511C5AF6"/>
     <w:multiLevelType w:val="multilevel"/>
     <w:tmpl w:val="2F0AD788"/>
@@ -3357,7 +3817,7 @@
       </w:rPr>
     </w:lvl>
   </w:abstractNum>
-  <w:abstractNum w:abstractNumId="6" w15:restartNumberingAfterBreak="0">
+  <w:abstractNum w:abstractNumId="9" w15:restartNumberingAfterBreak="0">
     <w:nsid w:val="615E1705"/>
     <w:multiLevelType w:val="multilevel"/>
     <w:tmpl w:val="A75AA096"/>
@@ -3578,7 +4038,7 @@
       </w:rPr>
     </w:lvl>
   </w:abstractNum>
-  <w:abstractNum w:abstractNumId="7" w15:restartNumberingAfterBreak="0">
+  <w:abstractNum w:abstractNumId="10" w15:restartNumberingAfterBreak="0">
     <w:nsid w:val="666D3D05"/>
     <w:multiLevelType w:val="multilevel"/>
     <w:tmpl w:val="562C2952"/>
@@ -3800,28 +4260,37 @@
     </w:lvl>
   </w:abstractNum>
   <w:num w:numId="1" w16cid:durableId="447361313">
-    <w:abstractNumId w:val="5"/>
+    <w:abstractNumId w:val="8"/>
   </w:num>
   <w:num w:numId="2" w16cid:durableId="1282031704">
-    <w:abstractNumId w:val="6"/>
+    <w:abstractNumId w:val="9"/>
   </w:num>
   <w:num w:numId="3" w16cid:durableId="1783769166">
-    <w:abstractNumId w:val="7"/>
+    <w:abstractNumId w:val="10"/>
   </w:num>
   <w:num w:numId="4" w16cid:durableId="2110812588">
-    <w:abstractNumId w:val="1"/>
+    <w:abstractNumId w:val="2"/>
   </w:num>
   <w:num w:numId="5" w16cid:durableId="1964115841">
-    <w:abstractNumId w:val="3"/>
+    <w:abstractNumId w:val="4"/>
   </w:num>
   <w:num w:numId="6" w16cid:durableId="877277712">
-    <w:abstractNumId w:val="2"/>
+    <w:abstractNumId w:val="3"/>
   </w:num>
   <w:num w:numId="7" w16cid:durableId="1613128252">
     <w:abstractNumId w:val="0"/>
   </w:num>
   <w:num w:numId="8" w16cid:durableId="1355039765">
-    <w:abstractNumId w:val="4"/>
+    <w:abstractNumId w:val="7"/>
+  </w:num>
+  <w:num w:numId="9" w16cid:durableId="194269744">
+    <w:abstractNumId w:val="6"/>
+  </w:num>
+  <w:num w:numId="10" w16cid:durableId="1356732017">
+    <w:abstractNumId w:val="1"/>
+  </w:num>
+  <w:num w:numId="11" w16cid:durableId="422531070">
+    <w:abstractNumId w:val="5"/>
   </w:num>
 </w:numbering>
 </file>
@@ -4224,6 +4693,7 @@
   <w:style w:type="paragraph" w:default="1" w:styleId="Normal">
     <w:name w:val="Normal"/>
     <w:qFormat/>
+    <w:rsid w:val="000353DE"/>
   </w:style>
   <w:style w:type="paragraph" w:styleId="Heading1">
     <w:name w:val="heading 1"/>
@@ -4303,6 +4773,7 @@
     <w:name w:val="heading 4"/>
     <w:basedOn w:val="Normal"/>
     <w:next w:val="Normal"/>
+    <w:link w:val="Heading4Char"/>
     <w:uiPriority w:val="9"/>
     <w:unhideWhenUsed/>
     <w:qFormat/>
@@ -4473,6 +4944,33 @@
     <w:rPr>
       <w:color w:val="605E5C"/>
       <w:shd w:val="clear" w:color="auto" w:fill="E1DFDD"/>
+    </w:rPr>
+  </w:style>
+  <w:style w:type="character" w:customStyle="1" w:styleId="Heading4Char">
+    <w:name w:val="Heading 4 Char"/>
+    <w:basedOn w:val="DefaultParagraphFont"/>
+    <w:link w:val="Heading4"/>
+    <w:uiPriority w:val="9"/>
+    <w:rsid w:val="001446E5"/>
+    <w:rPr>
+      <w:b/>
+      <w:bCs/>
+      <w:sz w:val="24"/>
+      <w:szCs w:val="24"/>
+    </w:rPr>
+  </w:style>
+  <w:style w:type="paragraph" w:styleId="ListParagraph">
+    <w:name w:val="List Paragraph"/>
+    <w:basedOn w:val="Normal"/>
+    <w:uiPriority w:val="34"/>
+    <w:qFormat/>
+    <w:rsid w:val="001446E5"/>
+    <w:pPr>
+      <w:ind w:left="720"/>
+      <w:contextualSpacing/>
+    </w:pPr>
+    <w:rPr>
+      <w:szCs w:val="28"/>
     </w:rPr>
   </w:style>
 </w:styles>

</xml_diff>